<commit_message>
feat: implement role change restrictions for admins and add command to advance approved batches
</commit_message>
<xml_diff>
--- a/ipc_app/docs/qa/BA_UAT_GoLive_Approval_IPC_APP.docx
+++ b/ipc_app/docs/qa/BA_UAT_GoLive_Approval_IPC_APP.docx
@@ -144,7 +144,7 @@
               <w:rPr>
                 <w:sz w:val="16"/>
               </w:rPr>
-              <w:t>1.0</w:t>
+              <w:t>1.1 (diperbarui 8 Oktober 2026)</w:t>
             </w:r>
           </w:p>
         </w:tc>
@@ -196,7 +196,28 @@
               <w:spacing w:after="0" w:line="240" w:lineRule="auto"/>
             </w:pPr>
             <w:r>
-              <w:t>QAC (QC Staff IPC, Approver/QA, Admin Aplikasi)</w:t>
+              <w:t xml:space="preserve">QAC (QC Staff IPC, </w:t>
+            </w:r>
+            <w:r>
+              <w:t xml:space="preserve">PIC </w:t>
+            </w:r>
+            <w:r>
+              <w:t>Aplikasi</w:t>
+            </w:r>
+            <w:r>
+              <w:t xml:space="preserve"> </w:t>
+            </w:r>
+            <w:r>
+              <w:t>/</w:t>
+            </w:r>
+            <w:r>
+              <w:t xml:space="preserve"> </w:t>
+            </w:r>
+            <w:r>
+              <w:t>Business Owner</w:t>
+            </w:r>
+            <w:r>
+              <w:t>, Admin Aplikasi)</w:t>
             </w:r>
           </w:p>
         </w:tc>
@@ -464,7 +485,13 @@
         <w:jc w:val="both"/>
       </w:pPr>
       <w:r>
-        <w:t>Pada hari ini, tanggal 7 Oktober 2026, telah dilakukan User Acceptance Test (UAT) atas aplikasi IPC - In Process Control (ipc_app), aplikasi quality-inspection produksi pengganti aplikasi Power Apps. Pengujian dijalankan melalui browser terhadap aplikasi yang berjalan, menggunakan akun uji yang mewakili setiap peran pengguna (QC Staff, Approver/QA, dan Admin Aplikasi), dengan satu batch uji dijalankan penuh dari pembuatan batch sampai berstatus Selesai. Hasil lengkapnya tertuang dalam Laporan Hasil UAT (Lampiran 2): dari 74 skenario, 71 lulus, 2 gagal, dan 1 tidak dapat diuji, dengan rekomendasi Diterima dengan Catatan. Berita Acara ini dibuat sebagai bukti bahwa hasil System Integration Testing (SIT) dan UAT tersebut telah ditinjau oleh perwakilan user, dan sebagai dasar keputusan penggunaan aplikasi secara live/production.</w:t>
+        <w:t xml:space="preserve">Pada hari ini, tanggal 7 Oktober 2026, telah dilakukan User Acceptance Test (UAT) atas aplikasi IPC - In Process Control (ipc_app), aplikasi quality-inspection produksi pengganti aplikasi Power Apps. Pengujian dijalankan melalui browser terhadap aplikasi yang berjalan, menggunakan akun uji yang mewakili setiap peran pengguna (QC Staff, </w:t>
+      </w:r>
+      <w:r>
+        <w:t>PIC Aplikasi/Business Owner</w:t>
+      </w:r>
+      <w:r>
+        <w:t>, dan Admin Aplikasi), dengan satu batch uji dijalankan penuh dari pembuatan batch sampai berstatus Selesai. Hasil lengkapnya tertuang dalam Laporan Hasil UAT (Lampiran 2): dari 74 skenario, 71 lulus, 2 gagal, dan 1 tidak dapat diuji, dengan rekomendasi Diterima dengan Catatan. Berita Acara ini dibuat sebagai bukti bahwa hasil System Integration Testing (SIT) dan UAT tersebut telah ditinjau oleh perwakilan user, dan sebagai dasar keputusan penggunaan aplikasi secara live/production.</w:t>
       </w:r>
     </w:p>
     <w:p>
@@ -1503,6 +1530,7 @@
               <w:rPr>
                 <w:sz w:val="14"/>
               </w:rPr>
+              <w:lastRenderedPageBreak/>
               <w:t>2</w:t>
             </w:r>
           </w:p>
@@ -2426,7 +2454,7 @@
               <w:rPr>
                 <w:sz w:val="14"/>
               </w:rPr>
-              <w:t>8/8 lulus. Data lama 26W003 CJB/AJB tertahan di Approval (Observasi O-1, Open Item 2).</w:t>
+              <w:t>8/8 lulus. Data lama 26W003 CJB/AJB tertahan di Approval (Observasi O-1, Open Item 2). Perbaikan data siap 8 Oktober 2026, dijalankan saat deploy.</w:t>
             </w:r>
           </w:p>
         </w:tc>
@@ -2783,7 +2811,7 @@
               <w:rPr>
                 <w:sz w:val="14"/>
               </w:rPr>
-              <w:t>4/5 lulus. USR-05 gagal: Admin bisa menurunkan role dirinya sendiri menjadi Staff dan kehilangan akses admin (temuan SIT H5). Lihat Open Item 1.</w:t>
+              <w:t>4/5 lulus. USR-05 gagal: Admin bisa menurunkan role dirinya sendiri menjadi Staff dan kehilangan akses admin (temuan SIT H5). Lihat Open Item 1. Diperbaiki 8 Oktober 2026 (menunggu deploy).</w:t>
             </w:r>
           </w:p>
         </w:tc>
@@ -3259,7 +3287,7 @@
               <w:rPr>
                 <w:sz w:val="14"/>
               </w:rPr>
-              <w:t>330/330 test lulus di ipc_system_testing (7 Oktober 2026); npm run build sukses.</w:t>
+              <w:t>330/330 test lulus di ipc_system_testing (7 Oktober 2026); npm run build sukses. Setelah perbaikan Open Item 1 dan 2 (8 Oktober 2026): 347/347 test lulus.</w:t>
             </w:r>
           </w:p>
         </w:tc>
@@ -3400,6 +3428,7 @@
         <w:pStyle w:val="SmallNote"/>
       </w:pPr>
       <w:r>
+        <w:lastRenderedPageBreak/>
         <w:t>Catatan: Rekomendasi Laporan Hasil UAT tanggal 7 Oktober 2026 adalah Diterima dengan Catatan. Item bertanda "Wajib sebelum go-live" pada Bagian 5 harus diselesaikan sebelum aplikasi digunakan secara live; catatan lain yang tidak menghambat operasional utama dapat ditindaklanjuti dengan monitoring dan support dari IT selama masa hypercare.</w:t>
       </w:r>
     </w:p>
@@ -3656,7 +3685,7 @@
               <w:rPr>
                 <w:sz w:val="15"/>
               </w:rPr>
-              <w:t>USR-05 / SIT H5 - Admin dapat menurunkan role akunnya sendiri menjadi Staff lewat dialog Edit User dan langsung kehilangan akses admin; bila hanya ada satu Admin, pemulihan harus lewat database. Perbaikan: larang ubah role diri sendiri dan larang menurunkan Admin aktif terakhir; pastikan ada lebih dari satu Admin aktif.</w:t>
+              <w:t>USR-05 / SIT H5 - Admin dapat menurunkan role akunnya sendiri menjadi Staff lewat dialog Edit User dan langsung kehilangan akses admin; bila hanya ada satu Admin, pemulihan harus lewat database. Perbaikan: larang ubah role diri sendiri dan larang menurunkan/menonaktifkan Admin aktif terakhir; pastikan ada lebih dari satu Admin aktif. SELESAI 8 Oktober 2026: aturan dipasang di server (aplikasi menolak dengan pesan jelas) dan di dialog Edit User (kolom Role akun sendiri dikunci); 4 test baru lulus.</w:t>
             </w:r>
           </w:p>
         </w:tc>
@@ -3745,7 +3774,7 @@
               <w:rPr>
                 <w:sz w:val="15"/>
               </w:rPr>
-              <w:t>Open - Wajib sebelum go-live</w:t>
+              <w:t>Selesai (kode) - aktif setelah deploy</w:t>
             </w:r>
           </w:p>
         </w:tc>
@@ -3793,7 +3822,7 @@
               <w:rPr>
                 <w:sz w:val="15"/>
               </w:rPr>
-              <w:t>Observasi O-1 - Batch lama 26W003 CJB dan AJB sudah Approved di kedua bagian wajib tetapi tertahan di tahap Approval dan tidak muncul di Approval Queue (di-approve sebelum aturan baru 5 Oktober 2026). Perlu perapian data sekali jalan agar maju ke tahap Print.</w:t>
+              <w:t>Observasi O-1 - Batch lama 26W003 CJB dan AJB sudah Approved di kedua bagian wajib tetapi tertahan di tahap Approval dan tidak muncul di Approval Queue (di-approve sebelum aturan baru 5 Oktober 2026). Perlu perapian data sekali jalan agar maju ke tahap Print. SIAP 8 Oktober 2026: perintah php artisan ipc:advance-approved-batches (opsi --dry-run untuk pratinjau) memajukan hanya batch yang masih di tahap Approval dengan kedua bagian wajib Approved; aman dijalankan berulang, 2 test baru lulus. Dijalankan sekali di server saat deploy.</w:t>
             </w:r>
           </w:p>
         </w:tc>
@@ -3882,7 +3911,7 @@
               <w:rPr>
                 <w:sz w:val="15"/>
               </w:rPr>
-              <w:t>Open - Wajib sebelum go-live</w:t>
+              <w:t>Perbaikan siap - jalankan sekali saat deploy</w:t>
             </w:r>
           </w:p>
         </w:tc>
@@ -4599,7 +4628,19 @@
         <w:jc w:val="both"/>
       </w:pPr>
       <w:r>
-        <w:t>Dengan ini, pihak user (perwakilan QC Staff IPC, Approver/QA, dan Admin Aplikasi dari Departemen QAC) menyatakan bahwa aplikasi IPC - In Process Control (ipc_app) telah diuji dan secara fungsi utama telah sesuai dengan kebutuhan operasional In Process Control produksi. Aplikasi telah memenuhi kebutuhan utama terkait pembuatan batch, Startup Check dan Start Inspection, Filling Check dengan TH Progress, Packing Check, Finished Good Check dengan AQL otomatis, Approval, cetak laporan PDF dan verifikasi QR, master data, manajemen user, tempat sampah, serta arsip batch. Berdasarkan hasil System Integration Testing (SIT tanggal 25 September 2026) dan hasil UAT tanggal 7 Oktober 2026, pihak user menyetujui agar aplikasi dapat digunakan secara live/production, dengan syarat item bertanda "Wajib sebelum go-live" pada Bagian 5 telah diselesaikan, dan fitur OCR baru digunakan setelah lulus uji ulang dari jaringan pabrik.</w:t>
+        <w:t>Dengan ini, pihak user (perwakilan QC Staff IPC</w:t>
+      </w:r>
+      <w:r>
+        <w:t xml:space="preserve"> dan</w:t>
+      </w:r>
+      <w:r>
+        <w:t xml:space="preserve"> </w:t>
+      </w:r>
+      <w:r>
+        <w:t>PIC Aplikasi/Business Owner</w:t>
+      </w:r>
+      <w:r>
+        <w:t>,dari Departemen QAC) menyatakan bahwa aplikasi IPC - In Process Control (ipc_app) telah diuji dan secara fungsi utama telah sesuai dengan kebutuhan operasional In Process Control produksi. Aplikasi telah memenuhi kebutuhan utama terkait pembuatan batch, Startup Check dan Start Inspection, Filling Check dengan TH Progress, Packing Check, Finished Good Check dengan AQL otomatis, Approval, cetak laporan PDF dan verifikasi QR, master data, manajemen user, tempat sampah, serta arsip batch. Berdasarkan hasil System Integration Testing (SIT tanggal 25 September 2026) dan hasil UAT tanggal 7 Oktober 2026, pihak user menyetujui agar aplikasi dapat digunakan secara live/production, dengan syarat item bertanda "Wajib sebelum go-live" pada Bagian 5 telah diselesaikan, dan fitur OCR baru digunakan setelah lulus uji ulang dari jaringan pabrik.</w:t>
       </w:r>
     </w:p>
     <w:p>
@@ -4834,6 +4875,7 @@
                 <w:color w:val="1F4E78"/>
                 <w:sz w:val="17"/>
               </w:rPr>
+              <w:lastRenderedPageBreak/>
               <w:t>User Training / Briefing</w:t>
             </w:r>
           </w:p>
@@ -5260,11 +5302,6 @@
             <w:pPr>
               <w:spacing w:after="0" w:line="240" w:lineRule="auto"/>
             </w:pPr>
-            <w:r>
-              <w:rPr>
-                <w:sz w:val="15"/>
-              </w:rPr>
-            </w:r>
           </w:p>
         </w:tc>
         <w:tc>
@@ -5307,7 +5344,6 @@
               <w:spacing w:after="0" w:line="240" w:lineRule="auto"/>
               <w:jc w:val="center"/>
             </w:pPr>
-            <w:r/>
           </w:p>
         </w:tc>
         <w:tc>
@@ -5326,7 +5362,6 @@
               <w:spacing w:after="0" w:line="240" w:lineRule="auto"/>
               <w:jc w:val="center"/>
             </w:pPr>
-            <w:r/>
           </w:p>
         </w:tc>
       </w:tr>
@@ -5374,11 +5409,6 @@
             <w:pPr>
               <w:spacing w:after="0" w:line="240" w:lineRule="auto"/>
             </w:pPr>
-            <w:r>
-              <w:rPr>
-                <w:sz w:val="15"/>
-              </w:rPr>
-            </w:r>
           </w:p>
         </w:tc>
         <w:tc>
@@ -5421,7 +5451,6 @@
               <w:spacing w:after="0" w:line="240" w:lineRule="auto"/>
               <w:jc w:val="center"/>
             </w:pPr>
-            <w:r/>
           </w:p>
         </w:tc>
         <w:tc>
@@ -5440,7 +5469,6 @@
               <w:spacing w:after="0" w:line="240" w:lineRule="auto"/>
               <w:jc w:val="center"/>
             </w:pPr>
-            <w:r/>
           </w:p>
         </w:tc>
       </w:tr>
@@ -5488,11 +5516,6 @@
             <w:pPr>
               <w:spacing w:after="0" w:line="240" w:lineRule="auto"/>
             </w:pPr>
-            <w:r>
-              <w:rPr>
-                <w:sz w:val="15"/>
-              </w:rPr>
-            </w:r>
           </w:p>
         </w:tc>
         <w:tc>
@@ -5535,7 +5558,6 @@
               <w:spacing w:after="0" w:line="240" w:lineRule="auto"/>
               <w:jc w:val="center"/>
             </w:pPr>
-            <w:r/>
           </w:p>
         </w:tc>
         <w:tc>
@@ -5554,7 +5576,6 @@
               <w:spacing w:after="0" w:line="240" w:lineRule="auto"/>
               <w:jc w:val="center"/>
             </w:pPr>
-            <w:r/>
           </w:p>
         </w:tc>
       </w:tr>
@@ -5602,11 +5623,6 @@
             <w:pPr>
               <w:spacing w:after="0" w:line="240" w:lineRule="auto"/>
             </w:pPr>
-            <w:r>
-              <w:rPr>
-                <w:sz w:val="15"/>
-              </w:rPr>
-            </w:r>
           </w:p>
         </w:tc>
         <w:tc>
@@ -5649,7 +5665,6 @@
               <w:spacing w:after="0" w:line="240" w:lineRule="auto"/>
               <w:jc w:val="center"/>
             </w:pPr>
-            <w:r/>
           </w:p>
         </w:tc>
         <w:tc>
@@ -5668,7 +5683,6 @@
               <w:spacing w:after="0" w:line="240" w:lineRule="auto"/>
               <w:jc w:val="center"/>
             </w:pPr>
-            <w:r/>
           </w:p>
         </w:tc>
       </w:tr>
@@ -5716,12 +5730,6 @@
             <w:pPr>
               <w:spacing w:after="0" w:line="240" w:lineRule="auto"/>
             </w:pPr>
-            <w:r>
-              <w:rPr>
-                <w:sz w:val="15"/>
-              </w:rPr>
-              <w:t>Bagus Chalil</w:t>
-            </w:r>
           </w:p>
         </w:tc>
         <w:tc>
@@ -5764,7 +5772,6 @@
               <w:spacing w:after="0" w:line="240" w:lineRule="auto"/>
               <w:jc w:val="center"/>
             </w:pPr>
-            <w:r/>
           </w:p>
         </w:tc>
         <w:tc>
@@ -5783,7 +5790,6 @@
               <w:spacing w:after="0" w:line="240" w:lineRule="auto"/>
               <w:jc w:val="center"/>
             </w:pPr>
-            <w:r/>
           </w:p>
         </w:tc>
       </w:tr>
@@ -5831,11 +5837,6 @@
             <w:pPr>
               <w:spacing w:after="0" w:line="240" w:lineRule="auto"/>
             </w:pPr>
-            <w:r>
-              <w:rPr>
-                <w:sz w:val="15"/>
-              </w:rPr>
-            </w:r>
           </w:p>
         </w:tc>
         <w:tc>
@@ -5878,7 +5879,6 @@
               <w:spacing w:after="0" w:line="240" w:lineRule="auto"/>
               <w:jc w:val="center"/>
             </w:pPr>
-            <w:r/>
           </w:p>
         </w:tc>
         <w:tc>
@@ -5897,7 +5897,6 @@
               <w:spacing w:after="0" w:line="240" w:lineRule="auto"/>
               <w:jc w:val="center"/>
             </w:pPr>
-            <w:r/>
           </w:p>
         </w:tc>
       </w:tr>

</xml_diff>

<commit_message>
feat: update UAT documentation and remove obsolete zip file
</commit_message>
<xml_diff>
--- a/ipc_app/docs/qa/BA_UAT_GoLive_Approval_IPC_APP.docx
+++ b/ipc_app/docs/qa/BA_UAT_GoLive_Approval_IPC_APP.docx
@@ -199,22 +199,7 @@
               <w:t xml:space="preserve">QAC (QC Staff IPC, </w:t>
             </w:r>
             <w:r>
-              <w:t xml:space="preserve">PIC </w:t>
-            </w:r>
-            <w:r>
-              <w:t>Aplikasi</w:t>
-            </w:r>
-            <w:r>
-              <w:t xml:space="preserve"> </w:t>
-            </w:r>
-            <w:r>
-              <w:t>/</w:t>
-            </w:r>
-            <w:r>
-              <w:t xml:space="preserve"> </w:t>
-            </w:r>
-            <w:r>
-              <w:t>Business Owner</w:t>
+              <w:t>PIC Aplikasi / Business Owner</w:t>
             </w:r>
             <w:r>
               <w:t>, Admin Aplikasi)</w:t>
@@ -485,13 +470,19 @@
         <w:jc w:val="both"/>
       </w:pPr>
       <w:r>
-        <w:t xml:space="preserve">Pada hari ini, tanggal 7 Oktober 2026, telah dilakukan User Acceptance Test (UAT) atas aplikasi IPC - In Process Control (ipc_app), aplikasi quality-inspection produksi pengganti aplikasi Power Apps. Pengujian dijalankan melalui browser terhadap aplikasi yang berjalan, menggunakan akun uji yang mewakili setiap peran pengguna (QC Staff, </w:t>
+        <w:t>Pada hari ini, tanggal 7 Oktober 2026, telah dilakukan User Acceptance Test (UAT) atas aplikasi IPC - In Process Control (ipc_app), aplikasi quality-inspection produksi pengganti aplikasi Power Apps. Pengujian dijalankan melalui browser terhadap aplikasi yang berjalan, menggunakan akun uji yang mewakili setiap peran pengguna (QC Staff</w:t>
+      </w:r>
+      <w:r>
+        <w:t xml:space="preserve"> dan</w:t>
+      </w:r>
+      <w:r>
+        <w:t xml:space="preserve"> </w:t>
       </w:r>
       <w:r>
         <w:t>PIC Aplikasi/Business Owner</w:t>
       </w:r>
       <w:r>
-        <w:t>, dan Admin Aplikasi), dengan satu batch uji dijalankan penuh dari pembuatan batch sampai berstatus Selesai. Hasil lengkapnya tertuang dalam Laporan Hasil UAT (Lampiran 2): dari 74 skenario, 71 lulus, 2 gagal, dan 1 tidak dapat diuji, dengan rekomendasi Diterima dengan Catatan. Berita Acara ini dibuat sebagai bukti bahwa hasil System Integration Testing (SIT) dan UAT tersebut telah ditinjau oleh perwakilan user, dan sebagai dasar keputusan penggunaan aplikasi secara live/production.</w:t>
+        <w:t>), dengan satu batch uji dijalankan penuh dari pembuatan batch sampai berstatus Selesai. Hasil lengkapnya tertuang dalam Laporan Hasil UAT (Lampiran 2): dari 74 skenario, 71 lulus, 2 gagal, dan 1 tidak dapat diuji, dengan rekomendasi Diterima dengan Catatan. Berita Acara ini dibuat sebagai bukti bahwa hasil System Integration Testing (SIT) dan UAT tersebut telah ditinjau oleh perwakilan user, dan sebagai dasar keputusan penggunaan aplikasi secara live/production.</w:t>
       </w:r>
     </w:p>
     <w:p>
@@ -1530,7 +1521,6 @@
               <w:rPr>
                 <w:sz w:val="14"/>
               </w:rPr>
-              <w:lastRenderedPageBreak/>
               <w:t>2</w:t>
             </w:r>
           </w:p>
@@ -1650,6 +1640,7 @@
               <w:rPr>
                 <w:sz w:val="14"/>
               </w:rPr>
+              <w:lastRenderedPageBreak/>
               <w:t>3</w:t>
             </w:r>
           </w:p>
@@ -3428,7 +3419,6 @@
         <w:pStyle w:val="SmallNote"/>
       </w:pPr>
       <w:r>
-        <w:lastRenderedPageBreak/>
         <w:t>Catatan: Rekomendasi Laporan Hasil UAT tanggal 7 Oktober 2026 adalah Diterima dengan Catatan. Item bertanda "Wajib sebelum go-live" pada Bagian 5 harus diselesaikan sebelum aplikasi digunakan secara live; catatan lain yang tidak menghambat operasional utama dapat ditindaklanjuti dengan monitoring dan support dari IT selama masa hypercare.</w:t>
       </w:r>
     </w:p>
@@ -5006,10 +4996,7 @@
               <w:spacing w:after="0" w:line="240" w:lineRule="auto"/>
             </w:pPr>
             <w:r>
-              <w:rPr>
-                <w:sz w:val="17"/>
-              </w:rPr>
-              <w:t>_____________________________</w:t>
+              <w:t>Mohammad Bagus Chalil Akbar</w:t>
             </w:r>
           </w:p>
         </w:tc>
@@ -5203,6 +5190,14 @@
               </w:rPr>
               <w:t>Department</w:t>
             </w:r>
+            <w:r>
+              <w:rPr>
+                <w:b/>
+                <w:color w:val="FFFFFF"/>
+                <w:sz w:val="15"/>
+              </w:rPr>
+              <w:t>/Tim</w:t>
+            </w:r>
           </w:p>
         </w:tc>
         <w:tc>
@@ -5326,6 +5321,12 @@
               </w:rPr>
               <w:t>QAC</w:t>
             </w:r>
+            <w:r>
+              <w:rPr>
+                <w:sz w:val="15"/>
+              </w:rPr>
+              <w:t>/QC</w:t>
+            </w:r>
           </w:p>
         </w:tc>
         <w:tc>
@@ -5387,10 +5388,7 @@
               <w:jc w:val="center"/>
             </w:pPr>
             <w:r>
-              <w:rPr>
-                <w:sz w:val="15"/>
-              </w:rPr>
-              <w:t>Approver / QA</w:t>
+              <w:t>PIC Aplikasi/Business Owner</w:t>
             </w:r>
           </w:p>
         </w:tc>
@@ -5432,6 +5430,12 @@
                 <w:sz w:val="15"/>
               </w:rPr>
               <w:t>QAC</w:t>
+            </w:r>
+            <w:r>
+              <w:rPr>
+                <w:sz w:val="15"/>
+              </w:rPr>
+              <w:t>/QC</w:t>
             </w:r>
           </w:p>
         </w:tc>
@@ -5497,7 +5501,7 @@
               <w:rPr>
                 <w:sz w:val="15"/>
               </w:rPr>
-              <w:t>Admin Aplikasi</w:t>
+              <w:t>Manager QAC</w:t>
             </w:r>
           </w:p>
         </w:tc>
@@ -5604,7 +5608,7 @@
               <w:rPr>
                 <w:sz w:val="15"/>
               </w:rPr>
-              <w:t>Manager QAC</w:t>
+              <w:t>IT PIC (Development)</w:t>
             </w:r>
           </w:p>
         </w:tc>
@@ -5623,6 +5627,9 @@
             <w:pPr>
               <w:spacing w:after="0" w:line="240" w:lineRule="auto"/>
             </w:pPr>
+            <w:r>
+              <w:t>Mohammad Bagus Chalil Akbar</w:t>
+            </w:r>
           </w:p>
         </w:tc>
         <w:tc>
@@ -5642,10 +5649,7 @@
               <w:jc w:val="center"/>
             </w:pPr>
             <w:r>
-              <w:rPr>
-                <w:sz w:val="15"/>
-              </w:rPr>
-              <w:t>QAC</w:t>
+              <w:t>Admin/IT</w:t>
             </w:r>
           </w:p>
         </w:tc>
@@ -5711,7 +5715,7 @@
               <w:rPr>
                 <w:sz w:val="15"/>
               </w:rPr>
-              <w:t>IT PIC (Development)</w:t>
+              <w:t>IT Management</w:t>
             </w:r>
           </w:p>
         </w:tc>
@@ -5749,117 +5753,7 @@
               <w:jc w:val="center"/>
             </w:pPr>
             <w:r>
-              <w:rPr>
-                <w:sz w:val="15"/>
-              </w:rPr>
-              <w:t>IT</w:t>
-            </w:r>
-          </w:p>
-        </w:tc>
-        <w:tc>
-          <w:tcPr>
-            <w:tcW w:w="2381" w:type="dxa"/>
-            <w:tcMar>
-              <w:top w:w="100" w:type="dxa"/>
-              <w:left w:w="55" w:type="dxa"/>
-              <w:bottom w:w="240" w:type="dxa"/>
-              <w:right w:w="55" w:type="dxa"/>
-            </w:tcMar>
-            <w:vAlign w:val="center"/>
-          </w:tcPr>
-          <w:p>
-            <w:pPr>
-              <w:spacing w:after="0" w:line="240" w:lineRule="auto"/>
-              <w:jc w:val="center"/>
-            </w:pPr>
-          </w:p>
-        </w:tc>
-        <w:tc>
-          <w:tcPr>
-            <w:tcW w:w="1587" w:type="dxa"/>
-            <w:tcMar>
-              <w:top w:w="100" w:type="dxa"/>
-              <w:left w:w="55" w:type="dxa"/>
-              <w:bottom w:w="240" w:type="dxa"/>
-              <w:right w:w="55" w:type="dxa"/>
-            </w:tcMar>
-            <w:vAlign w:val="center"/>
-          </w:tcPr>
-          <w:p>
-            <w:pPr>
-              <w:spacing w:after="0" w:line="240" w:lineRule="auto"/>
-              <w:jc w:val="center"/>
-            </w:pPr>
-          </w:p>
-        </w:tc>
-      </w:tr>
-      <w:tr>
-        <w:trPr>
-          <w:cantSplit/>
-          <w:jc w:val="center"/>
-        </w:trPr>
-        <w:tc>
-          <w:tcPr>
-            <w:tcW w:w="1871" w:type="dxa"/>
-            <w:tcMar>
-              <w:top w:w="100" w:type="dxa"/>
-              <w:left w:w="55" w:type="dxa"/>
-              <w:bottom w:w="240" w:type="dxa"/>
-              <w:right w:w="55" w:type="dxa"/>
-            </w:tcMar>
-            <w:vAlign w:val="center"/>
-          </w:tcPr>
-          <w:p>
-            <w:pPr>
-              <w:spacing w:after="0" w:line="240" w:lineRule="auto"/>
-              <w:jc w:val="center"/>
-            </w:pPr>
-            <w:r>
-              <w:rPr>
-                <w:sz w:val="15"/>
-              </w:rPr>
-              <w:t>IT Management</w:t>
-            </w:r>
-          </w:p>
-        </w:tc>
-        <w:tc>
-          <w:tcPr>
-            <w:tcW w:w="2324" w:type="dxa"/>
-            <w:tcMar>
-              <w:top w:w="100" w:type="dxa"/>
-              <w:left w:w="55" w:type="dxa"/>
-              <w:bottom w:w="240" w:type="dxa"/>
-              <w:right w:w="55" w:type="dxa"/>
-            </w:tcMar>
-            <w:vAlign w:val="center"/>
-          </w:tcPr>
-          <w:p>
-            <w:pPr>
-              <w:spacing w:after="0" w:line="240" w:lineRule="auto"/>
-            </w:pPr>
-          </w:p>
-        </w:tc>
-        <w:tc>
-          <w:tcPr>
-            <w:tcW w:w="1701" w:type="dxa"/>
-            <w:tcMar>
-              <w:top w:w="100" w:type="dxa"/>
-              <w:left w:w="55" w:type="dxa"/>
-              <w:bottom w:w="240" w:type="dxa"/>
-              <w:right w:w="55" w:type="dxa"/>
-            </w:tcMar>
-            <w:vAlign w:val="center"/>
-          </w:tcPr>
-          <w:p>
-            <w:pPr>
-              <w:spacing w:after="0" w:line="240" w:lineRule="auto"/>
-              <w:jc w:val="center"/>
-            </w:pPr>
-            <w:r>
-              <w:rPr>
-                <w:sz w:val="15"/>
-              </w:rPr>
-              <w:t>IT</w:t>
+              <w:t>Admin/IT</w:t>
             </w:r>
           </w:p>
         </w:tc>

</xml_diff>